<commit_message>
first stabil paralell running version :)
</commit_message>
<xml_diff>
--- a/linux_beginer.docx
+++ b/linux_beginer.docx
@@ -24,11 +24,149 @@
       </w:r>
       <w:proofErr w:type="spellEnd"/>
       <w:r>
-        <w:t xml:space="preserve"> python3 downloader.py &gt; output.txt &amp;</w:t>
-      </w:r>
+        <w:t xml:space="preserve"> python3 </w:t>
+      </w:r>
+      <w:proofErr w:type="gramStart"/>
+      <w:r>
+        <w:t>downloader.py &gt;</w:t>
+      </w:r>
+      <w:proofErr w:type="gramEnd"/>
+      <w:r>
+        <w:t xml:space="preserve"> output.txt &amp;</w:t>
+      </w:r>
+    </w:p>
+    <w:p/>
+    <w:p/>
+    <w:p>
+      <w:proofErr w:type="spellStart"/>
+      <w:r>
+        <w:t>install</w:t>
+      </w:r>
+      <w:proofErr w:type="spellEnd"/>
+      <w:r>
+        <w:t xml:space="preserve"> </w:t>
+      </w:r>
+      <w:proofErr w:type="spellStart"/>
+      <w:r>
+        <w:t>python</w:t>
+      </w:r>
+      <w:proofErr w:type="spellEnd"/>
+    </w:p>
+    <w:p>
+      <w:pPr>
+        <w:rPr>
+          <w:color w:val="D9D9D9" w:themeColor="background1" w:themeShade="D9"/>
+        </w:rPr>
+      </w:pPr>
+      <w:proofErr w:type="spellStart"/>
+      <w:r>
+        <w:rPr>
+          <w:color w:val="D9D9D9" w:themeColor="background1" w:themeShade="D9"/>
+        </w:rPr>
+        <w:t>u</w:t>
+      </w:r>
+      <w:r>
+        <w:rPr>
+          <w:color w:val="D9D9D9" w:themeColor="background1" w:themeShade="D9"/>
+        </w:rPr>
+        <w:t>buntu</w:t>
+      </w:r>
+      <w:proofErr w:type="spellEnd"/>
+      <w:r>
+        <w:rPr>
+          <w:color w:val="D9D9D9" w:themeColor="background1" w:themeShade="D9"/>
+        </w:rPr>
+        <w:t xml:space="preserve"> </w:t>
+      </w:r>
+      <w:r>
+        <w:rPr>
+          <w:color w:val="D9D9D9" w:themeColor="background1" w:themeShade="D9"/>
+        </w:rPr>
+        <w:t>frissítése</w:t>
+      </w:r>
+    </w:p>
+    <w:p>
+      <w:proofErr w:type="spellStart"/>
+      <w:r>
+        <w:t>sudo</w:t>
+      </w:r>
+      <w:proofErr w:type="spellEnd"/>
+      <w:r>
+        <w:t xml:space="preserve"> </w:t>
+      </w:r>
+      <w:proofErr w:type="spellStart"/>
+      <w:r>
+        <w:t>apt</w:t>
+      </w:r>
+      <w:proofErr w:type="spellEnd"/>
+      <w:r>
+        <w:t xml:space="preserve"> update</w:t>
+      </w:r>
+    </w:p>
+    <w:p>
+      <w:pPr>
+        <w:rPr>
+          <w:color w:val="D9D9D9" w:themeColor="background1" w:themeShade="D9"/>
+        </w:rPr>
+      </w:pPr>
+      <w:proofErr w:type="spellStart"/>
+      <w:r>
+        <w:rPr>
+          <w:color w:val="D9D9D9" w:themeColor="background1" w:themeShade="D9"/>
+        </w:rPr>
+        <w:t>python</w:t>
+      </w:r>
+      <w:proofErr w:type="spellEnd"/>
+      <w:r>
+        <w:rPr>
+          <w:color w:val="D9D9D9" w:themeColor="background1" w:themeShade="D9"/>
+        </w:rPr>
+        <w:t xml:space="preserve"> </w:t>
+      </w:r>
+      <w:proofErr w:type="gramStart"/>
+      <w:r>
+        <w:rPr>
+          <w:color w:val="D9D9D9" w:themeColor="background1" w:themeShade="D9"/>
+        </w:rPr>
+        <w:t>installálása</w:t>
+      </w:r>
+      <w:proofErr w:type="gramEnd"/>
+      <w:r>
+        <w:rPr>
+          <w:color w:val="D9D9D9" w:themeColor="background1" w:themeShade="D9"/>
+        </w:rPr>
+        <w:t xml:space="preserve"> 3.9</w:t>
+      </w:r>
+    </w:p>
+    <w:p>
       <w:bookmarkStart w:id="0" w:name="_GoBack"/>
-      <w:bookmarkEnd w:id="0"/>
+      <w:proofErr w:type="spellStart"/>
+      <w:r>
+        <w:t>sudo</w:t>
+      </w:r>
+      <w:proofErr w:type="spellEnd"/>
+      <w:r>
+        <w:t xml:space="preserve"> </w:t>
+      </w:r>
+      <w:proofErr w:type="spellStart"/>
+      <w:r>
+        <w:t>apt</w:t>
+      </w:r>
+      <w:proofErr w:type="spellEnd"/>
+      <w:r>
+        <w:t xml:space="preserve"> </w:t>
+      </w:r>
+      <w:proofErr w:type="spellStart"/>
+      <w:r>
+        <w:t>install</w:t>
+      </w:r>
+      <w:proofErr w:type="spellEnd"/>
+      <w:r>
+        <w:t xml:space="preserve"> python3 python3-pip</w:t>
+      </w:r>
     </w:p>
+    <w:bookmarkEnd w:id="0"/>
+    <w:p/>
     <w:sectPr>
       <w:pgSz w:w="11906" w:h="16838"/>
       <w:pgMar w:top="1417" w:right="1417" w:bottom="1417" w:left="1417" w:header="708" w:footer="708" w:gutter="0"/>

</xml_diff>